<commit_message>
docs: add explicit clickable repository links in PDF and DOCX reports (Page 2 & Referensi) matching Project 1 reference
</commit_message>
<xml_diff>
--- a/Project 2 - Industrial Grade - Rayhan Haldi - 545406.docx
+++ b/Project 2 - Industrial Grade - Rayhan Haldi - 545406.docx
@@ -168,6 +168,27 @@
         <w:t>5. Mengoptimasi parameter sistem untuk membuktikan tercapainya target return bulanan 3%–5%, return tahunan 50%–70%, maksimum drawdown di bawah 30%, dan maksimal 6 bulan loss per tahun.</w:t>
         <w:br/>
         <w:t>6. Mempublikasikan seluruh kode sumber, binary terkompilasi (.ex5), hasil backtest, visualisasi, dan laporan lengkap ke repositori GitHub.</w:t>
+      </w:r>
+    </w:p>
+    <w:p>
+      <w:pPr>
+        <w:pStyle w:val="Heading2"/>
+      </w:pPr>
+      <w:r>
+        <w:t>1.3 Tinjauan Referensi &amp; Tautan Repositori Proyek</w:t>
+      </w:r>
+    </w:p>
+    <w:p>
+      <w:r>
+        <w:t>Mengacu pada standar dokumentasi terbuka Proyek #1, seluruh artefak teknis Proyek #2 ini dapat diakses secara publik melalui tautan resmi berikut:</w:t>
+        <w:br/>
+        <w:t>• Tautan Repositori GitHub: https://github.com/VelAstra/Sains-Manajemen-Industrial-Grade</w:t>
+        <w:br/>
+        <w:t>• Tautan Kode Sumber MQL5 (.mq5 &amp; .ex5): https://github.com/VelAstra/Sains-Manajemen-Industrial-Grade/tree/main/MQL5</w:t>
+        <w:br/>
+        <w:t>• Repositori Referensi Proyek #1: https://github.com/VelAstra/Sains-Manajemen-10-EA-dengan-AI</w:t>
+        <w:br/>
+        <w:t>• Kanal Referensi EA MetaTrader 5: René Balke (BM Trading: https://youtu.be/T78Q7K3c11s / https://en.bmtrading.de) &amp; IQCapital (https://www.youtube.com/@IQCapital_io)</w:t>
       </w:r>
     </w:p>
     <w:p>
@@ -3894,21 +3915,21 @@
       <w:r>
         <w:t>1. Markowitz, H. (1952). Portfolio Selection. The Journal of Finance, 7(1), 77–91.</w:t>
         <w:br/>
-        <w:t>2. Balke, René. BM Trading — Free Expert Advisors for MetaTrader 5. https://en.bmtrading.de</w:t>
+        <w:t>2. Balke, René. BM Trading — Free Expert Advisors for MetaTrader 5. https://en.bmtrading.de (diakses 8 September 2026).</w:t>
         <w:br/>
-        <w:t>3. René Balke. Fully Working Moving Average MT5 Expert Advisor Programming Tutorial. YouTube: https://youtu.be/T78Q7K3c11s</w:t>
+        <w:t>3. René Balke. Fully Working Moving Average MT5 Expert Advisor Programming Tutorial. YouTube: https://youtu.be/T78Q7K3c11s (diakses 8 September 2026).</w:t>
         <w:br/>
-        <w:t>4. IQCapital. Automated Forex &amp; Multi-Asset Systems. YouTube: https://www.youtube.com/@IQCapital_io</w:t>
+        <w:t>4. IQCapital. Automated Forex &amp; Multi-Asset Systems. YouTube: https://www.youtube.com/@IQCapital_io (diakses 8 September 2026).</w:t>
         <w:br/>
-        <w:t>5. MetaQuotes Software Corp. MQL5 Reference: Algorithms and Trading Functions. https://www.mql5.com/en/docs</w:t>
+        <w:t>5. MetaQuotes Software Corp. MQL5 Reference: Algorithms and Trading Functions. https://www.mql5.com/en/docs (diakses 8 September 2026).</w:t>
         <w:br/>
-        <w:t>6. Exness Global Ltd. Contract Specifications &amp; Tick Data Architecture. https://www.exness.com</w:t>
+        <w:t>6. Exness Global Ltd. Contract Specifications &amp; Tick Data Architecture. https://www.exness.com (diakses 20 September 2026).</w:t>
         <w:br/>
         <w:t>7. Hermawan, Rayhan Haldi. (2026). Laporan Proyek #1: Pembuatan Sepuluh Expert Advisor (EA) untuk MetaTrader 5. Departemen Ilmu Komputer dan Elektronika, FMIPA UGM.</w:t>
         <w:br/>
-        <w:t>8. Repositori Proyek #1: https://github.com/VelAstra/Sains-Manajemen-10-EA-dengan-AI</w:t>
+        <w:t>8. Repositori Proyek #1: https://github.com/VelAstra/Sains-Manajemen-10-EA-dengan-AI (diakses 8 September 2026).</w:t>
         <w:br/>
-        <w:t>9. Repositori Proyek #2: https://github.com/VelAstra/Sains-Manajemen-Industrial-Grade</w:t>
+        <w:t>9. Repositori Proyek #2: https://github.com/VelAstra/Sains-Manajemen-Industrial-Grade (diakses 20 September 2026).</w:t>
         <w:br/>
       </w:r>
     </w:p>

</xml_diff>